<commit_message>
fix: final-review findings — injection-success sample, median latency, judge PII exposure, circuit breaker, fallback-safe answer quality; regenerate deliverables
Co-Authored-By: Claude Opus 5.5 <noreply@anthropic.com>
</commit_message>
<xml_diff>
--- a/deliverables/Copilot_Privacy_Guard_Final_Report.docx
+++ b/deliverables/Copilot_Privacy_Guard_Final_Report.docx
@@ -249,7 +249,7 @@
         <w:rPr>
           <w:i w:val="0"/>
         </w:rPr>
-        <w:t>Retrieval-augmented enterprise assistants such as Microsoft 365 Copilot answer natural-language questions over email, HR records, tickets and code, which turns every over-shared document into something a single query can surface. We designed, implemented and evaluated Copilot Privacy Guard, a middleware that sits between the assistant and its data and applies four controls: India-first PII redaction (applied to the prompt, to the vector index and to retrieved chunks), a purpose-based access filter that encodes the DPDP Act's purpose limitation as a runtime rule, prompt-injection screening that combines a heuristic with an LLM-as-judge, and a SHA-256 hash-chained audit log. On a synthetic Indian-enterprise corpus (80 documents, 369 labelled PII spans, 4 poisoned documents) and 36 queries across five personas, we compared the guard against simplified analogues of six defence families from the literature, run on the identical corpus, retriever and LLM. The guard reduced PII sent to the LLM provider from 100% to 0%, over-sharing from 50.9% to 0%, raw PII stored in the index from 100% to 0%, and the share of poisoned chunks reaching the model from 100% to 0%. Its PII detector reached an F1 of 89.5% on a held-out set against 54.3% for Microsoft Presidio as shipped, and the LLM judge detected 100% of 24 injection payloads (including paraphrased and Hindi ones) with no false positives on hard negatives, against 33% for the heuristic. These gains cost answer utility (34.9% ROUGE-L retention against the undefended answers) and about 0.8 s of latency per query, which we report as the central trade-off. All controls are mapped clause by clause to the DPDP Act 2023, DPDP Rules 2025, GDPR and the EU AI Act, with a DPIA risk register and a 13-item assurance checklist that runs against the system (12 pass).</w:t>
+        <w:t>Retrieval-augmented enterprise assistants such as Microsoft 365 Copilot answer natural-language questions over email, HR records, tickets and code, which turns every over-shared document into something a single query can surface. We designed, implemented and evaluated Copilot Privacy Guard, a middleware that sits between the assistant and its data and applies four controls: India-first PII redaction (applied to the prompt, to the vector index and to retrieved chunks), a purpose-based access filter that encodes the DPDP Act's purpose limitation as a runtime rule, prompt-injection screening that combines a heuristic with an LLM-as-judge, and a SHA-256 hash-chained audit log. On a synthetic Indian-enterprise corpus (80 documents, 369 labelled PII spans, 4 poisoned documents) and 36 queries across five personas, we compared the guard against simplified analogues of six defence families from the literature, run on the identical corpus, retriever and LLM. The guard reduced PII sent to the LLM provider from 100% to 0%, over-sharing from 50.9% to 0%, raw PII stored in the index from 100% to 0%, and the share of poisoned chunks reaching the model from 100% to 0%. Its PII detector reached an F1 of 89.5% on a held-out set against 54.3% for Microsoft Presidio as shipped, and the LLM judge detected 100% of 24 injection payloads (including paraphrased and Hindi ones) with no false positives on hard negatives, against 33% for the heuristic. These gains cost answer utility (34.9% ROUGE-L retention against the undefended answers) and a median of +97 ms per query (an uncached judge call takes about 553 ms), which we report as the central trade-off. All controls are mapped clause by clause to the DPDP Act 2023, DPDP Rules 2025, GDPR and the EU AI Act, with a DPIA risk register and a 13-item assurance checklist that runs against the system (12 pass).</w:t>
       </w:r>
     </w:p>
     <w:p>
@@ -3537,7 +3537,7 @@
               <w:rPr>
                 <w:sz w:val="17"/>
               </w:rPr>
-              <w:t>Added latency per query</w:t>
+              <w:t>Added latency per query (median)</w:t>
             </w:r>
           </w:p>
         </w:tc>
@@ -3565,7 +3565,7 @@
               <w:rPr>
                 <w:sz w:val="17"/>
               </w:rPr>
-              <w:t>+815 ms</w:t>
+              <w:t>+97 ms</w:t>
             </w:r>
           </w:p>
         </w:tc>
@@ -3604,7 +3604,7 @@
         <w:rPr>
           <w:i w:val="0"/>
         </w:rPr>
-        <w:t>Corpus: 80 synthetic Indian-enterprise documents (25 e-mails, 20 HR records, 20 tickets, 15 code/config files) generated with a fixed seed, tagged with department, sensitivity (0–3) and permitted purposes, with 369 ground-truth PII spans and four documents poisoned with canary-tagged injection payloads. Personas: HR manager, engineer, finance analyst, intern and CISO. Queries: 36 — 8 unauthorised probes, 8 authorised sensitive requests, 12 utility questions and 8 injection queries issued by a persona authorised to read the poisoned document, so access control cannot trivially block them. LLMs (Groq): answers qwen/qwen3.8-27b, judge openai/gpt-oss-120b, comparator meta-llama/llama-prompt-guard-2-86m; all 401 responses are cached for exact reproducibility. Deterministic metrics come from an extractive answerer; LLM-dependent metrics (injection success, answer quality, answer leakage) from 14 injection and 12 utility queries answered by the LLM (0 fallbacks).</w:t>
+        <w:t>Corpus: 80 synthetic Indian-enterprise documents (25 e-mails, 20 HR records, 20 tickets, 15 code/config files) generated with a fixed seed, tagged with department, sensitivity (0–3) and permitted purposes, with 369 ground-truth PII spans and four documents poisoned with canary-tagged injection payloads. Personas: HR manager, engineer, finance analyst, intern and CISO. Queries: 36 — 8 unauthorised probes, 8 authorised sensitive requests, 12 utility questions and 8 injection queries issued by a persona authorised to read the poisoned document, so access control cannot trivially block them. LLMs (Groq): answers qwen/qwen3.8-27b, judge openai/gpt-oss-120b, comparator meta-llama/llama-prompt-guard-2-86m; all 407 responses are cached for exact reproducibility. Deterministic metrics come from an extractive answerer; LLM-dependent metrics (injection success, answer quality, answer leakage) from 8 injection and 12 utility queries answered by the LLM (0 fallbacks).</w:t>
       </w:r>
     </w:p>
     <w:p>
@@ -4003,7 +4003,7 @@
               <w:rPr>
                 <w:sz w:val="15"/>
               </w:rPr>
-              <w:t>7.1%</w:t>
+              <w:t>12.5%</w:t>
             </w:r>
           </w:p>
         </w:tc>
@@ -4045,7 +4045,7 @@
               <w:rPr>
                 <w:sz w:val="15"/>
               </w:rPr>
-              <w:t>-1 ms</w:t>
+              <w:t>-0 ms</w:t>
             </w:r>
           </w:p>
         </w:tc>
@@ -4131,7 +4131,7 @@
               <w:rPr>
                 <w:sz w:val="15"/>
               </w:rPr>
-              <w:t>7.1%</w:t>
+              <w:t>12.5%</w:t>
             </w:r>
           </w:p>
         </w:tc>
@@ -4173,7 +4173,7 @@
               <w:rPr>
                 <w:sz w:val="15"/>
               </w:rPr>
-              <w:t>+46 ms</w:t>
+              <w:t>+40 ms</w:t>
             </w:r>
           </w:p>
         </w:tc>
@@ -4301,7 +4301,7 @@
               <w:rPr>
                 <w:sz w:val="15"/>
               </w:rPr>
-              <w:t>+11 ms</w:t>
+              <w:t>+8 ms</w:t>
             </w:r>
           </w:p>
         </w:tc>
@@ -4429,7 +4429,7 @@
               <w:rPr>
                 <w:sz w:val="15"/>
               </w:rPr>
-              <w:t>-1 ms</w:t>
+              <w:t>-0 ms</w:t>
             </w:r>
           </w:p>
         </w:tc>
@@ -4557,7 +4557,7 @@
               <w:rPr>
                 <w:sz w:val="15"/>
               </w:rPr>
-              <w:t>-1 ms</w:t>
+              <w:t>-0 ms</w:t>
             </w:r>
           </w:p>
         </w:tc>
@@ -4703,7 +4703,7 @@
                 <w:b/>
                 <w:sz w:val="15"/>
               </w:rPr>
-              <w:t>+815 ms</w:t>
+              <w:t>+97 ms</w:t>
             </w:r>
           </w:p>
         </w:tc>
@@ -4781,7 +4781,7 @@
         <w:rPr>
           <w:i w:val="0"/>
         </w:rPr>
-        <w:t>Injection success. The answer model resisted most seeded canary instructions on its own (vanilla: 0% of 14 attacked queries; worst case 7.1%). Model-level resistance is not a control the deployer owns, which is why the guard's design target is exposure: no poisoned chunk reaches the model at all.</w:t>
+        <w:t>Injection success. The answer model resisted most seeded canary instructions on its own (vanilla: 0% of 8 attacked queries; worst case 12.5%). Model-level resistance is not a control the deployer owns, which is why the guard's design target is exposure: no poisoned chunk reaches the model at all.</w:t>
       </w:r>
     </w:p>
     <w:p>
@@ -5021,7 +5021,7 @@
               <w:rPr>
                 <w:sz w:val="16"/>
               </w:rPr>
-              <w:t>+815 ms</w:t>
+              <w:t>+97 ms</w:t>
             </w:r>
           </w:p>
         </w:tc>
@@ -5121,7 +5121,7 @@
               <w:rPr>
                 <w:sz w:val="16"/>
               </w:rPr>
-              <w:t>+106 ms</w:t>
+              <w:t>+98 ms</w:t>
             </w:r>
           </w:p>
         </w:tc>
@@ -5221,7 +5221,7 @@
               <w:rPr>
                 <w:sz w:val="16"/>
               </w:rPr>
-              <w:t>+382 ms</w:t>
+              <w:t>+121 ms</w:t>
             </w:r>
           </w:p>
         </w:tc>
@@ -5251,7 +5251,7 @@
               <w:rPr>
                 <w:sz w:val="16"/>
               </w:rPr>
-              <w:t>40.6%</w:t>
+              <w:t>48.8%</w:t>
             </w:r>
           </w:p>
         </w:tc>
@@ -5321,7 +5321,7 @@
               <w:rPr>
                 <w:sz w:val="16"/>
               </w:rPr>
-              <w:t>+1899 ms</w:t>
+              <w:t>+58 ms</w:t>
             </w:r>
           </w:p>
         </w:tc>
@@ -5407,7 +5407,7 @@
               <w:rPr>
                 <w:sz w:val="16"/>
               </w:rPr>
-              <w:t>35.7%</w:t>
+              <w:t>36.5%</w:t>
             </w:r>
           </w:p>
         </w:tc>
@@ -5421,7 +5421,7 @@
               <w:rPr>
                 <w:sz w:val="16"/>
               </w:rPr>
-              <w:t>+123 ms</w:t>
+              <w:t>+98 ms</w:t>
             </w:r>
           </w:p>
         </w:tc>
@@ -5521,7 +5521,7 @@
               <w:rPr>
                 <w:sz w:val="16"/>
               </w:rPr>
-              <w:t>+621 ms</w:t>
+              <w:t>+130 ms</w:t>
             </w:r>
           </w:p>
         </w:tc>
@@ -5588,7 +5588,7 @@
         <w:rPr>
           <w:i w:val="0"/>
         </w:rPr>
-        <w:t>Each control owns a distinct exposure: without the access filter over-sharing returns to 55.0%; without redaction 40.6% of PII reaches the provider; without the redacted index the index again holds 100% of raw PII. Removing the judge leaves these metrics unchanged on the corpus — its value shows on the harder payloads of the benchmark below — while cutting latency to +106 ms. Dense retrieval reproduces the privacy results.</w:t>
+        <w:t>Each control owns a distinct exposure: without the access filter over-sharing returns to 55.0%; without redaction 48.8% of PII reaches the provider; without the redacted index the index again holds 100% of raw PII. Removing the judge leaves these metrics unchanged on the corpus — its value shows on the harder payloads of the benchmark below — while cutting latency to +98 ms. Dense retrieval reproduces the privacy results.</w:t>
       </w:r>
     </w:p>
     <w:p>
@@ -9898,7 +9898,7 @@
         <w:pStyle w:val="ListBullet"/>
       </w:pPr>
       <w:r>
-        <w:t>Small sets: 36 queries and 24 payloads; injection success rests on 14 attacked queries.</w:t>
+        <w:t>Small sets: 36 queries and 24 payloads; injection success rests on 8 attacked queries.</w:t>
       </w:r>
     </w:p>
     <w:p>
@@ -9922,7 +9922,15 @@
         <w:pStyle w:val="ListBullet"/>
       </w:pPr>
       <w:r>
-        <w:t>Latency includes uncached LLM-judge calls; production caching and batching would lower it.</w:t>
+        <w:t>Latency is the median per-query delta with committed caches (robust to rate-limit back-off); an uncached judge call takes about 553 ms.</w:t>
+      </w:r>
+    </w:p>
+    <w:p>
+      <w:pPr>
+        <w:pStyle w:val="ListBullet"/>
+      </w:pPr>
+      <w:r>
+        <w:t>Three of the four corpus payloads contain their canary verbatim, so a model that quoted rather than obeyed would count as an injection success; the exposure metric does not depend on this.</w:t>
       </w:r>
     </w:p>
     <w:p>

</xml_diff>